<commit_message>
docs: describe Kanban workflow in progress report
</commit_message>
<xml_diff>
--- a/Open_Pothole_Tracker_Progress_Report_Increment_1.docx
+++ b/Open_Pothole_Tracker_Progress_Report_Increment_1.docx
@@ -331,11 +331,42 @@
         <w:spacing w:before="120" w:after="120" w:line="240" w:lineRule="auto"/>
         <w:ind w:left="360"/>
         <w:rPr>
+          <w:rFonts w:ascii="Times New Roman" w:hAnsi="Times New Roman"/>
+          <w:sz w:val="24"/>
+        </w:rPr>
+      </w:pPr>
+      <w:r>
+        <w:rPr>
+          <w:rFonts w:ascii="Times New Roman" w:hAnsi="Times New Roman"/>
+          <w:sz w:val="24"/>
+        </w:rPr>
+        <w:t>Our team follows Kanban to organize and track project work. Tasks are assigned to team members and move through To Do, In Progress, Review, and Done. We review the board regularly to monitor progress, identify blockers, and coordinate dependencies.</w:t>
+      </w:r>
+    </w:p>
+    <w:p>
+      <w:pPr>
+        <w:spacing w:before="120" w:after="120" w:line="240" w:lineRule="auto"/>
+        <w:ind w:left="360"/>
+        <w:rPr>
           <w:rFonts w:ascii="Times New Roman" w:eastAsia="Times New Roman" w:hAnsi="Times New Roman" w:cs="Times New Roman"/>
           <w:bCs/>
           <w:i/>
         </w:rPr>
       </w:pPr>
+      <w:r>
+        <w:rPr>
+          <w:rFonts w:ascii="Times New Roman" w:hAnsi="Times New Roman"/>
+          <w:sz w:val="24"/>
+        </w:rPr>
+        <w:t xml:space="preserve"> </w:t>
+      </w:r>
+      <w:r>
+        <w:rPr>
+          <w:rFonts w:ascii="Times New Roman" w:hAnsi="Times New Roman"/>
+          <w:sz w:val="24"/>
+        </w:rPr>
+        <w:br/>
+      </w:r>
       <w:r>
         <w:rPr>
           <w:rFonts w:ascii="Times New Roman" w:hAnsi="Times New Roman"/>
@@ -468,6 +499,7 @@
           <w:rFonts w:ascii="Times New Roman" w:hAnsi="Times New Roman"/>
           <w:sz w:val="24"/>
         </w:rPr>
+        <w:lastRenderedPageBreak/>
         <w:t xml:space="preserve">Frontend integration exposed an API-contract mismatch. During an early browser test, /api/potholes?limit=100 returned 404. A later backend sync added pothole list/detail routes, so that original 404 is outdated, but the </w:t>
       </w:r>
       <w:proofErr w:type="gramStart"/>
@@ -484,7 +516,7 @@
           <w:rFonts w:ascii="Times New Roman" w:hAnsi="Times New Roman"/>
           <w:sz w:val="24"/>
         </w:rPr>
-        <w:t xml:space="preserve"> still requests a different parameter and response shape from the current backend. </w:t>
+        <w:t xml:space="preserve"> still requests a different parameter and response shape from the current backend.</w:t>
       </w:r>
     </w:p>
     <w:p>
@@ -970,7 +1002,7 @@
           <w:sz w:val="24"/>
         </w:rPr>
         <w:br/>
-        <w:t xml:space="preserve">Our current focus is integration. Early testing confirmed that the frontend can reach the backend and database, but it also exposed a mismatch between the data format requested by the map interface and the format currently provided by the backend. We have since added more backend pothole routes, but the updated contract still needs end-to-end retesting with real pothole data. A separate nearby-pothole query has passed automated tests, although it still needs validation against a live PostGIS </w:t>
+        <w:t xml:space="preserve">Our current focus is integration. Early testing confirmed that the frontend can reach the backend and </w:t>
       </w:r>
       <w:r>
         <w:rPr>
@@ -978,7 +1010,7 @@
           <w:sz w:val="24"/>
         </w:rPr>
         <w:lastRenderedPageBreak/>
-        <w:t>database.</w:t>
+        <w:t>database, but it also exposed a mismatch between the data format requested by the map interface and the format currently provided by the backend. We have since added more backend pothole routes, but the updated contract still needs end-to-end retesting with real pothole data. A separate nearby-pothole query has passed automated tests, although it still needs validation against a live PostGIS database.</w:t>
       </w:r>
       <w:r>
         <w:rPr>

</xml_diff>

<commit_message>
Add contributions from Linh
</commit_message>
<xml_diff>
--- a/Open_Pothole_Tracker_Progress_Report_Increment_1.docx
+++ b/Open_Pothole_Tracker_Progress_Report_Increment_1.docx
@@ -58,7 +58,15 @@
           <w:b/>
           <w:sz w:val="24"/>
         </w:rPr>
-        <w:t>Group #Y</w:t>
+        <w:t xml:space="preserve">Group </w:t>
+      </w:r>
+      <w:r>
+        <w:rPr>
+          <w:rFonts w:ascii="Times New Roman" w:hAnsi="Times New Roman" w:cs="Times New Roman"/>
+          <w:b/>
+          <w:sz w:val="24"/>
+        </w:rPr>
+        <w:t>Open Pothole Tracker</w:t>
       </w:r>
     </w:p>
     <w:p>
@@ -597,6 +605,265 @@
         <w:spacing w:before="120" w:after="120" w:line="240" w:lineRule="auto"/>
         <w:ind w:left="360"/>
         <w:rPr>
+          <w:rFonts w:ascii="Times New Roman" w:hAnsi="Times New Roman"/>
+          <w:sz w:val="24"/>
+        </w:rPr>
+      </w:pPr>
+      <w:r>
+        <w:rPr>
+          <w:rFonts w:ascii="Times New Roman" w:hAnsi="Times New Roman"/>
+          <w:b/>
+          <w:sz w:val="24"/>
+        </w:rPr>
+        <w:t>Linh Nguyen</w:t>
+      </w:r>
+      <w:r>
+        <w:rPr>
+          <w:rFonts w:ascii="Times New Roman" w:hAnsi="Times New Roman"/>
+          <w:b/>
+          <w:sz w:val="24"/>
+        </w:rPr>
+        <w:t>:</w:t>
+      </w:r>
+      <w:r>
+        <w:rPr>
+          <w:rFonts w:ascii="Times New Roman" w:hAnsi="Times New Roman"/>
+          <w:sz w:val="24"/>
+        </w:rPr>
+        <w:t xml:space="preserve"> </w:t>
+      </w:r>
+      <w:r>
+        <w:rPr>
+          <w:rFonts w:ascii="Times New Roman" w:hAnsi="Times New Roman"/>
+          <w:sz w:val="24"/>
+        </w:rPr>
+        <w:t>B</w:t>
+      </w:r>
+      <w:r>
+        <w:rPr>
+          <w:rFonts w:ascii="Times New Roman" w:hAnsi="Times New Roman"/>
+          <w:sz w:val="24"/>
+        </w:rPr>
+        <w:t>ackend, database, and real-time systems.</w:t>
+      </w:r>
+    </w:p>
+    <w:p>
+      <w:pPr>
+        <w:numPr>
+          <w:ilvl w:val="0"/>
+          <w:numId w:val="5"/>
+        </w:numPr>
+        <w:spacing w:before="120" w:after="120" w:line="240" w:lineRule="auto"/>
+        <w:rPr>
+          <w:rFonts w:ascii="Times New Roman" w:hAnsi="Times New Roman"/>
+          <w:sz w:val="24"/>
+        </w:rPr>
+      </w:pPr>
+      <w:r>
+        <w:rPr>
+          <w:rFonts w:ascii="Times New Roman" w:hAnsi="Times New Roman"/>
+          <w:b/>
+          <w:bCs/>
+          <w:sz w:val="24"/>
+        </w:rPr>
+        <w:t>Contributions:</w:t>
+      </w:r>
+      <w:r>
+        <w:rPr>
+          <w:rFonts w:ascii="Times New Roman" w:hAnsi="Times New Roman"/>
+          <w:sz w:val="24"/>
+        </w:rPr>
+        <w:t xml:space="preserve"> Implemented the </w:t>
+      </w:r>
+      <w:proofErr w:type="spellStart"/>
+      <w:r>
+        <w:rPr>
+          <w:rFonts w:ascii="Times New Roman" w:hAnsi="Times New Roman"/>
+          <w:sz w:val="24"/>
+        </w:rPr>
+        <w:t>PotholeModel</w:t>
+      </w:r>
+      <w:proofErr w:type="spellEnd"/>
+      <w:r>
+        <w:rPr>
+          <w:rFonts w:ascii="Times New Roman" w:hAnsi="Times New Roman"/>
+          <w:sz w:val="24"/>
+        </w:rPr>
+        <w:t xml:space="preserve"> and contributed the detection-service interface, image preprocessing, </w:t>
+      </w:r>
+      <w:proofErr w:type="spellStart"/>
+      <w:r>
+        <w:rPr>
+          <w:rFonts w:ascii="Times New Roman" w:hAnsi="Times New Roman"/>
+          <w:sz w:val="24"/>
+        </w:rPr>
+        <w:t>Roboflow</w:t>
+      </w:r>
+      <w:proofErr w:type="spellEnd"/>
+      <w:r>
+        <w:rPr>
+          <w:rFonts w:ascii="Times New Roman" w:hAnsi="Times New Roman"/>
+          <w:sz w:val="24"/>
+        </w:rPr>
+        <w:t xml:space="preserve"> inference adapter, and HTTP image-analysis endpoint</w:t>
+      </w:r>
+      <w:r>
+        <w:rPr>
+          <w:rFonts w:ascii="Times New Roman" w:hAnsi="Times New Roman"/>
+          <w:sz w:val="24"/>
+        </w:rPr>
+        <w:t xml:space="preserve">. </w:t>
+      </w:r>
+      <w:r>
+        <w:rPr>
+          <w:rFonts w:ascii="Times New Roman" w:hAnsi="Times New Roman"/>
+          <w:sz w:val="24"/>
+        </w:rPr>
+        <w:t>Collaborated with teammates on Part 1 and Part 6 of the RD report</w:t>
+      </w:r>
+      <w:r>
+        <w:rPr>
+          <w:rFonts w:ascii="Times New Roman" w:hAnsi="Times New Roman"/>
+          <w:sz w:val="24"/>
+        </w:rPr>
+        <w:t>, some parts in Progress Report</w:t>
+      </w:r>
+      <w:r>
+        <w:rPr>
+          <w:rFonts w:ascii="Times New Roman" w:hAnsi="Times New Roman"/>
+          <w:sz w:val="24"/>
+        </w:rPr>
+        <w:t xml:space="preserve"> and across the IT report, with most of my work focused on testing Parts 3</w:t>
+      </w:r>
+      <w:r>
+        <w:rPr>
+          <w:rFonts w:ascii="Times New Roman" w:hAnsi="Times New Roman"/>
+          <w:sz w:val="24"/>
+        </w:rPr>
+        <w:t>-</w:t>
+      </w:r>
+      <w:r>
+        <w:rPr>
+          <w:rFonts w:ascii="Times New Roman" w:hAnsi="Times New Roman"/>
+          <w:sz w:val="24"/>
+        </w:rPr>
+        <w:t>5.</w:t>
+      </w:r>
+    </w:p>
+    <w:p>
+      <w:pPr>
+        <w:numPr>
+          <w:ilvl w:val="0"/>
+          <w:numId w:val="5"/>
+        </w:numPr>
+        <w:spacing w:before="120" w:after="120" w:line="240" w:lineRule="auto"/>
+        <w:rPr>
+          <w:rFonts w:ascii="Times New Roman" w:hAnsi="Times New Roman"/>
+          <w:sz w:val="24"/>
+        </w:rPr>
+      </w:pPr>
+      <w:r>
+        <w:rPr>
+          <w:rFonts w:ascii="Times New Roman" w:hAnsi="Times New Roman"/>
+          <w:b/>
+          <w:bCs/>
+          <w:sz w:val="24"/>
+        </w:rPr>
+        <w:t>Challenges and resolution:</w:t>
+      </w:r>
+      <w:r>
+        <w:rPr>
+          <w:rFonts w:ascii="Times New Roman" w:hAnsi="Times New Roman"/>
+          <w:sz w:val="24"/>
+        </w:rPr>
+        <w:t xml:space="preserve"> Live </w:t>
+      </w:r>
+      <w:proofErr w:type="spellStart"/>
+      <w:r>
+        <w:rPr>
+          <w:rFonts w:ascii="Times New Roman" w:hAnsi="Times New Roman"/>
+          <w:sz w:val="24"/>
+        </w:rPr>
+        <w:t>Roboflow</w:t>
+      </w:r>
+      <w:proofErr w:type="spellEnd"/>
+      <w:r>
+        <w:rPr>
+          <w:rFonts w:ascii="Times New Roman" w:hAnsi="Times New Roman"/>
+          <w:sz w:val="24"/>
+        </w:rPr>
+        <w:t xml:space="preserve"> inference still needs valid model credentials and may consume credits, so the endpoint was </w:t>
+      </w:r>
+      <w:proofErr w:type="gramStart"/>
+      <w:r>
+        <w:rPr>
+          <w:rFonts w:ascii="Times New Roman" w:hAnsi="Times New Roman"/>
+          <w:sz w:val="24"/>
+        </w:rPr>
+        <w:t>smoke-tested</w:t>
+      </w:r>
+      <w:proofErr w:type="gramEnd"/>
+      <w:r>
+        <w:rPr>
+          <w:rFonts w:ascii="Times New Roman" w:hAnsi="Times New Roman"/>
+          <w:sz w:val="24"/>
+        </w:rPr>
+        <w:t xml:space="preserve"> with a mocked response. The RD and IT reports are still </w:t>
+      </w:r>
+      <w:proofErr w:type="gramStart"/>
+      <w:r>
+        <w:rPr>
+          <w:rFonts w:ascii="Times New Roman" w:hAnsi="Times New Roman"/>
+          <w:sz w:val="24"/>
+        </w:rPr>
+        <w:t>works</w:t>
+      </w:r>
+      <w:proofErr w:type="gramEnd"/>
+      <w:r>
+        <w:rPr>
+          <w:rFonts w:ascii="Times New Roman" w:hAnsi="Times New Roman"/>
+          <w:sz w:val="24"/>
+        </w:rPr>
+        <w:t xml:space="preserve"> in progress; most planned tests cannot be completed yet because several required features are not implemented or integrated.</w:t>
+      </w:r>
+    </w:p>
+    <w:p>
+      <w:pPr>
+        <w:numPr>
+          <w:ilvl w:val="0"/>
+          <w:numId w:val="5"/>
+        </w:numPr>
+        <w:spacing w:before="120" w:after="120" w:line="240" w:lineRule="auto"/>
+        <w:rPr>
+          <w:rFonts w:ascii="Times New Roman" w:hAnsi="Times New Roman"/>
+          <w:sz w:val="24"/>
+        </w:rPr>
+      </w:pPr>
+      <w:r>
+        <w:rPr>
+          <w:rFonts w:ascii="Times New Roman" w:hAnsi="Times New Roman"/>
+          <w:b/>
+          <w:bCs/>
+          <w:sz w:val="24"/>
+        </w:rPr>
+        <w:t>Remaining work or blocker:</w:t>
+      </w:r>
+      <w:r>
+        <w:rPr>
+          <w:rFonts w:ascii="Times New Roman" w:hAnsi="Times New Roman"/>
+          <w:sz w:val="24"/>
+        </w:rPr>
+        <w:t xml:space="preserve"> Complete the reports collaboratively as the project develops; implement remaining features, then run the planned functional, performance, accessibility, and security tests. Test inference against a real trained model when credentials are available.</w:t>
+      </w:r>
+    </w:p>
+    <w:p>
+      <w:pPr>
+        <w:tabs>
+          <w:tab w:val="left" w:pos="5910"/>
+        </w:tabs>
+        <w:spacing w:before="120" w:after="120" w:line="240" w:lineRule="auto"/>
+        <w:ind w:left="360"/>
+        <w:rPr>
           <w:rFonts w:ascii="Times New Roman" w:eastAsia="Times New Roman" w:hAnsi="Times New Roman" w:cs="Times New Roman"/>
           <w:bCs/>
           <w:i/>
@@ -605,22 +872,6 @@
       <w:r>
         <w:rPr>
           <w:rFonts w:ascii="Times New Roman" w:hAnsi="Times New Roman"/>
-          <w:b/>
-          <w:sz w:val="24"/>
-        </w:rPr>
-        <w:t>Linh Nguyen</w:t>
-      </w:r>
-      <w:r>
-        <w:rPr>
-          <w:rFonts w:ascii="Times New Roman" w:hAnsi="Times New Roman"/>
-          <w:b/>
-          <w:sz w:val="24"/>
-        </w:rPr>
-        <w:t>:</w:t>
-      </w:r>
-      <w:r>
-        <w:rPr>
-          <w:rFonts w:ascii="Times New Roman" w:hAnsi="Times New Roman"/>
           <w:sz w:val="24"/>
         </w:rPr>
         <w:t xml:space="preserve"> </w:t>
@@ -630,14 +881,7 @@
           <w:rFonts w:ascii="Times New Roman" w:hAnsi="Times New Roman"/>
           <w:sz w:val="24"/>
         </w:rPr>
-        <w:t>B</w:t>
-      </w:r>
-      <w:r>
-        <w:rPr>
-          <w:rFonts w:ascii="Times New Roman" w:hAnsi="Times New Roman"/>
-          <w:sz w:val="24"/>
-        </w:rPr>
-        <w:t xml:space="preserve">ackend, database, and real-time systems. </w:t>
+        <w:tab/>
       </w:r>
     </w:p>
     <w:p>
@@ -930,6 +1174,7 @@
           <w:b/>
           <w:iCs/>
         </w:rPr>
+        <w:lastRenderedPageBreak/>
         <w:t>Stakeholder Communication</w:t>
       </w:r>
     </w:p>
@@ -1002,15 +1247,7 @@
           <w:sz w:val="24"/>
         </w:rPr>
         <w:br/>
-        <w:t xml:space="preserve">Our current focus is integration. Early testing confirmed that the frontend can reach the backend and </w:t>
-      </w:r>
-      <w:r>
-        <w:rPr>
-          <w:rFonts w:ascii="Times New Roman" w:hAnsi="Times New Roman"/>
-          <w:sz w:val="24"/>
-        </w:rPr>
-        <w:lastRenderedPageBreak/>
-        <w:t>database, but it also exposed a mismatch between the data format requested by the map interface and the format currently provided by the backend. We have since added more backend pothole routes, but the updated contract still needs end-to-end retesting with real pothole data. A separate nearby-pothole query has passed automated tests, although it still needs validation against a live PostGIS database.</w:t>
+        <w:t>Our current focus is integration. Early testing confirmed that the frontend can reach the backend and database, but it also exposed a mismatch between the data format requested by the map interface and the format currently provided by the backend. We have since added more backend pothole routes, but the updated contract still needs end-to-end retesting with real pothole data. A separate nearby-pothole query has passed automated tests, although it still needs validation against a live PostGIS database.</w:t>
       </w:r>
       <w:r>
         <w:rPr>
@@ -1338,6 +1575,155 @@
     </w:lvl>
   </w:abstractNum>
   <w:abstractNum w:abstractNumId="2" w15:restartNumberingAfterBreak="0">
+    <w:nsid w:val="49DC393B"/>
+    <w:multiLevelType w:val="multilevel"/>
+    <w:tmpl w:val="BA88AB76"/>
+    <w:lvl w:ilvl="0">
+      <w:start w:val="1"/>
+      <w:numFmt w:val="bullet"/>
+      <w:lvlText w:val=""/>
+      <w:lvlJc w:val="left"/>
+      <w:pPr>
+        <w:tabs>
+          <w:tab w:val="num" w:pos="720"/>
+        </w:tabs>
+        <w:ind w:left="720" w:hanging="360"/>
+      </w:pPr>
+      <w:rPr>
+        <w:rFonts w:ascii="Symbol" w:hAnsi="Symbol" w:hint="default"/>
+        <w:sz w:val="20"/>
+      </w:rPr>
+    </w:lvl>
+    <w:lvl w:ilvl="1" w:tentative="1">
+      <w:start w:val="1"/>
+      <w:numFmt w:val="bullet"/>
+      <w:lvlText w:val="o"/>
+      <w:lvlJc w:val="left"/>
+      <w:pPr>
+        <w:tabs>
+          <w:tab w:val="num" w:pos="1440"/>
+        </w:tabs>
+        <w:ind w:left="1440" w:hanging="360"/>
+      </w:pPr>
+      <w:rPr>
+        <w:rFonts w:ascii="Courier New" w:hAnsi="Courier New" w:hint="default"/>
+        <w:sz w:val="20"/>
+      </w:rPr>
+    </w:lvl>
+    <w:lvl w:ilvl="2" w:tentative="1">
+      <w:start w:val="1"/>
+      <w:numFmt w:val="bullet"/>
+      <w:lvlText w:val=""/>
+      <w:lvlJc w:val="left"/>
+      <w:pPr>
+        <w:tabs>
+          <w:tab w:val="num" w:pos="2160"/>
+        </w:tabs>
+        <w:ind w:left="2160" w:hanging="360"/>
+      </w:pPr>
+      <w:rPr>
+        <w:rFonts w:ascii="Wingdings" w:hAnsi="Wingdings" w:hint="default"/>
+        <w:sz w:val="20"/>
+      </w:rPr>
+    </w:lvl>
+    <w:lvl w:ilvl="3" w:tentative="1">
+      <w:start w:val="1"/>
+      <w:numFmt w:val="bullet"/>
+      <w:lvlText w:val=""/>
+      <w:lvlJc w:val="left"/>
+      <w:pPr>
+        <w:tabs>
+          <w:tab w:val="num" w:pos="2880"/>
+        </w:tabs>
+        <w:ind w:left="2880" w:hanging="360"/>
+      </w:pPr>
+      <w:rPr>
+        <w:rFonts w:ascii="Wingdings" w:hAnsi="Wingdings" w:hint="default"/>
+        <w:sz w:val="20"/>
+      </w:rPr>
+    </w:lvl>
+    <w:lvl w:ilvl="4" w:tentative="1">
+      <w:start w:val="1"/>
+      <w:numFmt w:val="bullet"/>
+      <w:lvlText w:val=""/>
+      <w:lvlJc w:val="left"/>
+      <w:pPr>
+        <w:tabs>
+          <w:tab w:val="num" w:pos="3600"/>
+        </w:tabs>
+        <w:ind w:left="3600" w:hanging="360"/>
+      </w:pPr>
+      <w:rPr>
+        <w:rFonts w:ascii="Wingdings" w:hAnsi="Wingdings" w:hint="default"/>
+        <w:sz w:val="20"/>
+      </w:rPr>
+    </w:lvl>
+    <w:lvl w:ilvl="5" w:tentative="1">
+      <w:start w:val="1"/>
+      <w:numFmt w:val="bullet"/>
+      <w:lvlText w:val=""/>
+      <w:lvlJc w:val="left"/>
+      <w:pPr>
+        <w:tabs>
+          <w:tab w:val="num" w:pos="4320"/>
+        </w:tabs>
+        <w:ind w:left="4320" w:hanging="360"/>
+      </w:pPr>
+      <w:rPr>
+        <w:rFonts w:ascii="Wingdings" w:hAnsi="Wingdings" w:hint="default"/>
+        <w:sz w:val="20"/>
+      </w:rPr>
+    </w:lvl>
+    <w:lvl w:ilvl="6" w:tentative="1">
+      <w:start w:val="1"/>
+      <w:numFmt w:val="bullet"/>
+      <w:lvlText w:val=""/>
+      <w:lvlJc w:val="left"/>
+      <w:pPr>
+        <w:tabs>
+          <w:tab w:val="num" w:pos="5040"/>
+        </w:tabs>
+        <w:ind w:left="5040" w:hanging="360"/>
+      </w:pPr>
+      <w:rPr>
+        <w:rFonts w:ascii="Wingdings" w:hAnsi="Wingdings" w:hint="default"/>
+        <w:sz w:val="20"/>
+      </w:rPr>
+    </w:lvl>
+    <w:lvl w:ilvl="7" w:tentative="1">
+      <w:start w:val="1"/>
+      <w:numFmt w:val="bullet"/>
+      <w:lvlText w:val=""/>
+      <w:lvlJc w:val="left"/>
+      <w:pPr>
+        <w:tabs>
+          <w:tab w:val="num" w:pos="5760"/>
+        </w:tabs>
+        <w:ind w:left="5760" w:hanging="360"/>
+      </w:pPr>
+      <w:rPr>
+        <w:rFonts w:ascii="Wingdings" w:hAnsi="Wingdings" w:hint="default"/>
+        <w:sz w:val="20"/>
+      </w:rPr>
+    </w:lvl>
+    <w:lvl w:ilvl="8" w:tentative="1">
+      <w:start w:val="1"/>
+      <w:numFmt w:val="bullet"/>
+      <w:lvlText w:val=""/>
+      <w:lvlJc w:val="left"/>
+      <w:pPr>
+        <w:tabs>
+          <w:tab w:val="num" w:pos="6480"/>
+        </w:tabs>
+        <w:ind w:left="6480" w:hanging="360"/>
+      </w:pPr>
+      <w:rPr>
+        <w:rFonts w:ascii="Wingdings" w:hAnsi="Wingdings" w:hint="default"/>
+        <w:sz w:val="20"/>
+      </w:rPr>
+    </w:lvl>
+  </w:abstractNum>
+  <w:abstractNum w:abstractNumId="3" w15:restartNumberingAfterBreak="0">
     <w:nsid w:val="4F221E97"/>
     <w:multiLevelType w:val="hybridMultilevel"/>
     <w:tmpl w:val="93EA020E"/>
@@ -1450,7 +1836,7 @@
       </w:rPr>
     </w:lvl>
   </w:abstractNum>
-  <w:abstractNum w:abstractNumId="3" w15:restartNumberingAfterBreak="0">
+  <w:abstractNum w:abstractNumId="4" w15:restartNumberingAfterBreak="0">
     <w:nsid w:val="571A3EED"/>
     <w:multiLevelType w:val="hybridMultilevel"/>
     <w:tmpl w:val="F22C2AC2"/>
@@ -1537,7 +1923,7 @@
     </w:lvl>
   </w:abstractNum>
   <w:num w:numId="1" w16cid:durableId="1815873446">
-    <w:abstractNumId w:val="2"/>
+    <w:abstractNumId w:val="3"/>
   </w:num>
   <w:num w:numId="2" w16cid:durableId="2041081141">
     <w:abstractNumId w:val="1"/>
@@ -1546,7 +1932,10 @@
     <w:abstractNumId w:val="0"/>
   </w:num>
   <w:num w:numId="4" w16cid:durableId="2061778786">
-    <w:abstractNumId w:val="3"/>
+    <w:abstractNumId w:val="4"/>
+  </w:num>
+  <w:num w:numId="5" w16cid:durableId="635573991">
+    <w:abstractNumId w:val="2"/>
   </w:num>
 </w:numbering>
 </file>
@@ -2013,6 +2402,29 @@
       <w:contextualSpacing/>
     </w:pPr>
   </w:style>
+  <w:style w:type="character" w:styleId="Hyperlink">
+    <w:name w:val="Hyperlink"/>
+    <w:basedOn w:val="DefaultParagraphFont"/>
+    <w:uiPriority w:val="99"/>
+    <w:unhideWhenUsed/>
+    <w:rsid w:val="00EB793B"/>
+    <w:rPr>
+      <w:color w:val="0563C1" w:themeColor="hyperlink"/>
+      <w:u w:val="single"/>
+    </w:rPr>
+  </w:style>
+  <w:style w:type="character" w:styleId="UnresolvedMention">
+    <w:name w:val="Unresolved Mention"/>
+    <w:basedOn w:val="DefaultParagraphFont"/>
+    <w:uiPriority w:val="99"/>
+    <w:semiHidden/>
+    <w:unhideWhenUsed/>
+    <w:rsid w:val="00EB793B"/>
+    <w:rPr>
+      <w:color w:val="605E5C"/>
+      <w:shd w:val="clear" w:color="auto" w:fill="E1DFDD"/>
+    </w:rPr>
+  </w:style>
 </w:styles>
 </file>
 

</xml_diff>